<commit_message>
docs: clean up DESIGN_DOC cover — drop the verbose v3.1.0 release note from the title page
The first page had a big bold "3.1.0 — flaky-network resilience (P1)" changelog
blockquote crammed under the metadata table. pandoc renders blockquotes with the
Block Text style, which in this reference doc is a plain full-width paragraph, so
it read as broken/cluttered on a client-facing cover. The version + date are
already in the metadata table and the full detail is in CHANGELOG.md, so the note
was redundant. Replaced it with a one-line italic pointer to the changelog and
regenerated the .docx.

(Confirmed via block-structure diff that the gfm→markdown reader switch did NOT
change the header; the clutter was the note itself.)
</commit_message>
<xml_diff>
--- a/docs/DESIGN_DOC.docx
+++ b/docs/DESIGN_DOC.docx
@@ -2,7 +2,7 @@
 <file path=word/document.xml><?xml version="1.0" encoding="utf-8"?>
 <w:document xmlns:w="http://schemas.openxmlformats.org/wordprocessingml/2006/main" xmlns:m="http://schemas.openxmlformats.org/officeDocument/2006/math" xmlns:r="http://schemas.openxmlformats.org/officeDocument/2006/relationships" xmlns:o="urn:schemas-microsoft-com:office:office" xmlns:v="urn:schemas-microsoft-com:vml" xmlns:w10="urn:schemas-microsoft-com:office:word" xmlns:a="http://schemas.openxmlformats.org/drawingml/2006/main" xmlns:pic="http://schemas.openxmlformats.org/drawingml/2006/picture" xmlns:wp="http://schemas.openxmlformats.org/drawingml/2006/wordprocessingDrawing">
   <w:body>
-    <w:bookmarkStart w:id="107" w:name="aep-data-lifecycle-helper"/>
+    <w:bookmarkStart w:id="108" w:name="aep-data-lifecycle-helper"/>
     <w:p>
       <w:pPr>
         <w:pStyle w:val="Heading1"/>
@@ -11,7 +11,7 @@
         <w:t xml:space="preserve">AEP Data Lifecycle Helper</w:t>
       </w:r>
     </w:p>
-    <w:bookmarkStart w:id="22" w:name="design-architecture-document"/>
+    <w:bookmarkStart w:id="23" w:name="design-architecture-document"/>
     <w:p>
       <w:pPr>
         <w:pStyle w:val="Heading2"/>
@@ -266,149 +266,38 @@
     </w:tbl>
     <w:p>
       <w:pPr>
-        <w:pStyle w:val="BlockText"/>
-      </w:pPr>
-      <w:r>
-        <w:rPr>
-          <w:bCs/>
-          <w:b/>
-        </w:rPr>
-        <w:t xml:space="preserve">3.1.0 (2026-06-03) — flaky-network resilience (P1).</w:t>
-      </w:r>
-      <w:r>
-        <w:t xml:space="preserve"> </w:t>
-      </w:r>
-      <w:r>
-        <w:t xml:space="preserve">After a live prod</w:t>
-      </w:r>
-      <w:r>
-        <w:t xml:space="preserve"> </w:t>
-      </w:r>
-      <w:r>
-        <w:t xml:space="preserve">incident on an intermittent Wi-Fi link to Adobe: (1) the</w:t>
-      </w:r>
-      <w:r>
-        <w:t xml:space="preserve"> </w:t>
-      </w:r>
-      <w:r>
-        <w:rPr>
-          <w:rStyle w:val="VerbatimChar"/>
-        </w:rPr>
-        <w:t xml:space="preserve">/quota</w:t>
-      </w:r>
-      <w:r>
-        <w:t xml:space="preserve"> </w:t>
-      </w:r>
-      <w:r>
-        <w:t xml:space="preserve">submit</w:t>
-      </w:r>
-      <w:r>
-        <w:t xml:space="preserve"> </w:t>
-      </w:r>
-      <w:r>
-        <w:t xml:space="preserve">preflight now retries the live fetch (default 3×, backoff) so a transient</w:t>
-      </w:r>
-      <w:r>
-        <w:t xml:space="preserve"> </w:t>
-      </w:r>
-      <w:r>
-        <w:t xml:space="preserve">timeout self-heals into a fresh snapshot instead of blocking the submit —</w:t>
-      </w:r>
-      <w:r>
-        <w:t xml:space="preserve"> </w:t>
-      </w:r>
-      <w:r>
-        <w:t xml:space="preserve">the fail-closed refuse-stale boundary (I15) is unchanged; (2) the status</w:t>
-      </w:r>
-      <w:r>
-        <w:t xml:space="preserve"> </w:t>
-      </w:r>
-      <w:r>
-        <w:t xml:space="preserve">monitor applies per-WO exponential backoff so an outage can’t flood the link</w:t>
-      </w:r>
-      <w:r>
-        <w:t xml:space="preserve"> </w:t>
-      </w:r>
-      <w:r>
-        <w:t xml:space="preserve">or starve a concurrent submit (DISPLAY-only, never touches the quota ledger);</w:t>
-      </w:r>
-      <w:r>
-        <w:t xml:space="preserve"> </w:t>
-      </w:r>
-      <w:r>
-        <w:t xml:space="preserve">(3)</w:t>
-      </w:r>
-      <w:r>
-        <w:t xml:space="preserve"> </w:t>
-      </w:r>
-      <w:r>
-        <w:rPr>
-          <w:rStyle w:val="VerbatimChar"/>
-        </w:rPr>
-        <w:t xml:space="preserve">GET /jobs/:id</w:t>
-      </w:r>
-      <w:r>
-        <w:t xml:space="preserve"> </w:t>
-      </w:r>
-      <w:r>
-        <w:t xml:space="preserve">no longer runs the heavy namespace GROUP-BY on the hot</w:t>
-      </w:r>
-      <w:r>
-        <w:t xml:space="preserve"> </w:t>
-      </w:r>
-      <w:r>
-        <w:t xml:space="preserve">path (opt-in via</w:t>
-      </w:r>
-      <w:r>
-        <w:t xml:space="preserve"> </w:t>
-      </w:r>
-      <w:r>
-        <w:rPr>
-          <w:rStyle w:val="VerbatimChar"/>
-        </w:rPr>
-        <w:t xml:space="preserve">?breakdown=1</w:t>
-      </w:r>
-      <w:r>
-        <w:t xml:space="preserve">), fixing the</w:t>
-      </w:r>
-      <w:r>
-        <w:t xml:space="preserve"> </w:t>
-      </w:r>
-      <w:r>
-        <w:t xml:space="preserve">“</w:t>
-      </w:r>
-      <w:r>
-        <w:t xml:space="preserve">click freezes then opens</w:t>
-      </w:r>
-      <w:r>
-        <w:t xml:space="preserve">”</w:t>
-      </w:r>
-      <w:r>
-        <w:t xml:space="preserve"> </w:t>
-      </w:r>
-      <w:r>
-        <w:t xml:space="preserve">lag.</w:t>
-      </w:r>
-      <w:r>
-        <w:t xml:space="preserve"> </w:t>
-      </w:r>
-      <w:r>
-        <w:t xml:space="preserve">See</w:t>
-      </w:r>
-      <w:r>
-        <w:t xml:space="preserve"> </w:t>
-      </w:r>
-      <w:r>
-        <w:rPr>
-          <w:rStyle w:val="VerbatimChar"/>
-        </w:rPr>
-        <w:t xml:space="preserve">docs/CHANGELOG.md</w:t>
-      </w:r>
-      <w:r>
-        <w:t xml:space="preserve"> </w:t>
-      </w:r>
-      <w:r>
-        <w:t xml:space="preserve">→ 2026-06-01 (P1).</w:t>
+        <w:pStyle w:val="BodyText"/>
+      </w:pPr>
+      <w:r>
+        <w:rPr>
+          <w:iCs/>
+          <w:i/>
+        </w:rPr>
+        <w:t xml:space="preserve">Full change history:</w:t>
+      </w:r>
+      <w:r>
+        <w:rPr>
+          <w:iCs/>
+          <w:i/>
+        </w:rPr>
+        <w:t xml:space="preserve"> </w:t>
+      </w:r>
+      <w:hyperlink r:id="rId22">
+        <w:r>
+          <w:rPr>
+            <w:rStyle w:val="VerbatimChar"/>
+            <w:iCs/>
+            <w:i/>
+          </w:rPr>
+          <w:t xml:space="preserve">docs/CHANGELOG.md</w:t>
+        </w:r>
+      </w:hyperlink>
+      <w:r>
+        <w:rPr>
+          <w:iCs/>
+          <w:i/>
+        </w:rPr>
+        <w:t xml:space="preserve">.</w:t>
       </w:r>
     </w:p>
     <w:p>
@@ -418,8 +307,8 @@
         </w:pict>
       </w:r>
     </w:p>
-    <w:bookmarkEnd w:id="22"/>
-    <w:bookmarkStart w:id="24" w:name="table-of-contents"/>
+    <w:bookmarkEnd w:id="23"/>
+    <w:bookmarkStart w:id="25" w:name="table-of-contents"/>
     <w:p>
       <w:pPr>
         <w:pStyle w:val="Heading2"/>
@@ -834,7 +723,7 @@
       <w:r>
         <w:t xml:space="preserve"> </w:t>
       </w:r>
-      <w:hyperlink r:id="rId23">
+      <w:hyperlink r:id="rId24">
         <w:r>
           <w:rPr>
             <w:rStyle w:val="VerbatimChar"/>
@@ -910,8 +799,8 @@
         </w:pict>
       </w:r>
     </w:p>
-    <w:bookmarkEnd w:id="24"/>
-    <w:bookmarkStart w:id="29" w:name="executive-summary"/>
+    <w:bookmarkEnd w:id="25"/>
+    <w:bookmarkStart w:id="30" w:name="executive-summary"/>
     <w:p>
       <w:pPr>
         <w:pStyle w:val="Heading2"/>
@@ -920,7 +809,7 @@
         <w:t xml:space="preserve">1. Executive Summary</w:t>
       </w:r>
     </w:p>
-    <w:bookmarkStart w:id="25" w:name="what-this-tool-does"/>
+    <w:bookmarkStart w:id="26" w:name="what-this-tool-does"/>
     <w:p>
       <w:pPr>
         <w:pStyle w:val="Heading3"/>
@@ -1107,8 +996,8 @@
         <w:t xml:space="preserve">a browser dashboard.</w:t>
       </w:r>
     </w:p>
-    <w:bookmarkEnd w:id="25"/>
-    <w:bookmarkStart w:id="26" w:name="why-it-was-built"/>
+    <w:bookmarkEnd w:id="26"/>
+    <w:bookmarkStart w:id="27" w:name="why-it-was-built"/>
     <w:p>
       <w:pPr>
         <w:pStyle w:val="Heading3"/>
@@ -1161,8 +1050,8 @@
         <w:t xml:space="preserve">operators can stop and resume at any time.</w:t>
       </w:r>
     </w:p>
-    <w:bookmarkEnd w:id="26"/>
-    <w:bookmarkStart w:id="27" w:name="key-capabilities"/>
+    <w:bookmarkEnd w:id="27"/>
+    <w:bookmarkStart w:id="28" w:name="key-capabilities"/>
     <w:p>
       <w:pPr>
         <w:pStyle w:val="Heading3"/>
@@ -1398,8 +1287,8 @@
         </w:tc>
       </w:tr>
     </w:tbl>
-    <w:bookmarkEnd w:id="27"/>
-    <w:bookmarkStart w:id="28" w:name="architecture-principles"/>
+    <w:bookmarkEnd w:id="28"/>
+    <w:bookmarkStart w:id="29" w:name="architecture-principles"/>
     <w:p>
       <w:pPr>
         <w:pStyle w:val="Heading3"/>
@@ -1533,9 +1422,9 @@
         </w:pict>
       </w:r>
     </w:p>
-    <w:bookmarkEnd w:id="28"/>
     <w:bookmarkEnd w:id="29"/>
-    <w:bookmarkStart w:id="34" w:name="system-architecture"/>
+    <w:bookmarkEnd w:id="30"/>
+    <w:bookmarkStart w:id="35" w:name="system-architecture"/>
     <w:p>
       <w:pPr>
         <w:pStyle w:val="Heading2"/>
@@ -1544,7 +1433,7 @@
         <w:t xml:space="preserve">2. System Architecture</w:t>
       </w:r>
     </w:p>
-    <w:bookmarkStart w:id="31" w:name="high-level-architecture"/>
+    <w:bookmarkStart w:id="32" w:name="high-level-architecture"/>
     <w:p>
       <w:pPr>
         <w:pStyle w:val="Heading3"/>
@@ -1599,7 +1488,7 @@
                     </pic:cNvPicPr>
                   </pic:nvPicPr>
                   <pic:blipFill>
-                    <a:blip r:embed="rId30"/>
+                    <a:blip r:embed="rId31"/>
                     <a:stretch>
                       <a:fillRect/>
                     </a:stretch>
@@ -1753,8 +1642,8 @@
         <w:t xml:space="preserve">.</w:t>
       </w:r>
     </w:p>
-    <w:bookmarkEnd w:id="31"/>
-    <w:bookmarkStart w:id="32" w:name="component-summary"/>
+    <w:bookmarkEnd w:id="32"/>
+    <w:bookmarkStart w:id="33" w:name="component-summary"/>
     <w:p>
       <w:pPr>
         <w:pStyle w:val="Heading3"/>
@@ -2456,8 +2345,8 @@
         </w:tc>
       </w:tr>
     </w:tbl>
-    <w:bookmarkEnd w:id="32"/>
-    <w:bookmarkStart w:id="33" w:name="technology-stack"/>
+    <w:bookmarkEnd w:id="33"/>
+    <w:bookmarkStart w:id="34" w:name="technology-stack"/>
     <w:p>
       <w:pPr>
         <w:pStyle w:val="Heading3"/>
@@ -2850,9 +2739,9 @@
         </w:pict>
       </w:r>
     </w:p>
-    <w:bookmarkEnd w:id="33"/>
     <w:bookmarkEnd w:id="34"/>
-    <w:bookmarkStart w:id="40" w:name="end-to-end-data-flow"/>
+    <w:bookmarkEnd w:id="35"/>
+    <w:bookmarkStart w:id="41" w:name="end-to-end-data-flow"/>
     <w:p>
       <w:pPr>
         <w:pStyle w:val="Heading2"/>
@@ -2861,7 +2750,7 @@
         <w:t xml:space="preserve">3. End-to-End Data Flow</w:t>
       </w:r>
     </w:p>
-    <w:bookmarkStart w:id="36" w:name="operator-journey-overview"/>
+    <w:bookmarkStart w:id="37" w:name="operator-journey-overview"/>
     <w:p>
       <w:pPr>
         <w:pStyle w:val="Heading3"/>
@@ -2890,7 +2779,7 @@
                     </pic:cNvPicPr>
                   </pic:nvPicPr>
                   <pic:blipFill>
-                    <a:blip r:embed="rId35"/>
+                    <a:blip r:embed="rId36"/>
                     <a:stretch>
                       <a:fillRect/>
                     </a:stretch>
@@ -3137,8 +3026,8 @@
         <w:t xml:space="preserve">.</w:t>
       </w:r>
     </w:p>
-    <w:bookmarkEnd w:id="36"/>
-    <w:bookmarkStart w:id="38" w:name="expansion-data-flow"/>
+    <w:bookmarkEnd w:id="37"/>
+    <w:bookmarkStart w:id="39" w:name="expansion-data-flow"/>
     <w:p>
       <w:pPr>
         <w:pStyle w:val="Heading3"/>
@@ -3193,7 +3082,7 @@
                     </pic:cNvPicPr>
                   </pic:nvPicPr>
                   <pic:blipFill>
-                    <a:blip r:embed="rId37"/>
+                    <a:blip r:embed="rId38"/>
                     <a:stretch>
                       <a:fillRect/>
                     </a:stretch>
@@ -3732,8 +3621,8 @@
         <w:t xml:space="preserve">.</w:t>
       </w:r>
     </w:p>
-    <w:bookmarkEnd w:id="38"/>
-    <w:bookmarkStart w:id="39" w:name="step-by-step-detail"/>
+    <w:bookmarkEnd w:id="39"/>
+    <w:bookmarkStart w:id="40" w:name="step-by-step-detail"/>
     <w:p>
       <w:pPr>
         <w:pStyle w:val="Heading3"/>
@@ -5155,9 +5044,9 @@
         </w:pict>
       </w:r>
     </w:p>
-    <w:bookmarkEnd w:id="39"/>
     <w:bookmarkEnd w:id="40"/>
-    <w:bookmarkStart w:id="47" w:name="work-order-lifecycle"/>
+    <w:bookmarkEnd w:id="41"/>
+    <w:bookmarkStart w:id="48" w:name="work-order-lifecycle"/>
     <w:p>
       <w:pPr>
         <w:pStyle w:val="Heading2"/>
@@ -5166,7 +5055,7 @@
         <w:t xml:space="preserve">4. Work Order Lifecycle</w:t>
       </w:r>
     </w:p>
-    <w:bookmarkStart w:id="42" w:name="state-machine"/>
+    <w:bookmarkStart w:id="43" w:name="state-machine"/>
     <w:p>
       <w:pPr>
         <w:pStyle w:val="Heading3"/>
@@ -5236,7 +5125,7 @@
                     </pic:cNvPicPr>
                   </pic:nvPicPr>
                   <pic:blipFill>
-                    <a:blip r:embed="rId41"/>
+                    <a:blip r:embed="rId42"/>
                     <a:stretch>
                       <a:fillRect/>
                     </a:stretch>
@@ -5704,8 +5593,8 @@
         <w:t xml:space="preserve">.</w:t>
       </w:r>
     </w:p>
-    <w:bookmarkEnd w:id="42"/>
-    <w:bookmarkStart w:id="43" w:name="crash-uncertain-submit-recovery"/>
+    <w:bookmarkEnd w:id="43"/>
+    <w:bookmarkStart w:id="44" w:name="crash-uncertain-submit-recovery"/>
     <w:p>
       <w:pPr>
         <w:pStyle w:val="Heading3"/>
@@ -6288,8 +6177,8 @@
         <w:t xml:space="preserve">restart required.</w:t>
       </w:r>
     </w:p>
-    <w:bookmarkEnd w:id="43"/>
-    <w:bookmarkStart w:id="44" w:name="status-reference"/>
+    <w:bookmarkEnd w:id="44"/>
+    <w:bookmarkStart w:id="45" w:name="status-reference"/>
     <w:p>
       <w:pPr>
         <w:pStyle w:val="Heading3"/>
@@ -6739,8 +6628,8 @@
         </w:tc>
       </w:tr>
     </w:tbl>
-    <w:bookmarkEnd w:id="44"/>
-    <w:bookmarkStart w:id="46" w:name="submit-reconcile-flow"/>
+    <w:bookmarkEnd w:id="45"/>
+    <w:bookmarkStart w:id="47" w:name="submit-reconcile-flow"/>
     <w:p>
       <w:pPr>
         <w:pStyle w:val="Heading3"/>
@@ -6789,7 +6678,7 @@
                     </pic:cNvPicPr>
                   </pic:nvPicPr>
                   <pic:blipFill>
-                    <a:blip r:embed="rId45"/>
+                    <a:blip r:embed="rId46"/>
                     <a:stretch>
                       <a:fillRect/>
                     </a:stretch>
@@ -7063,9 +6952,9 @@
         </w:pict>
       </w:r>
     </w:p>
-    <w:bookmarkEnd w:id="46"/>
     <w:bookmarkEnd w:id="47"/>
-    <w:bookmarkStart w:id="52" w:name="multi-month-quota-planning"/>
+    <w:bookmarkEnd w:id="48"/>
+    <w:bookmarkStart w:id="53" w:name="multi-month-quota-planning"/>
     <w:p>
       <w:pPr>
         <w:pStyle w:val="Heading2"/>
@@ -7074,7 +6963,7 @@
         <w:t xml:space="preserve">5. Multi-Month Quota Planning</w:t>
       </w:r>
     </w:p>
-    <w:bookmarkStart w:id="48" w:name="why-multi-month-planning-exists"/>
+    <w:bookmarkStart w:id="49" w:name="why-multi-month-planning-exists"/>
     <w:p>
       <w:pPr>
         <w:pStyle w:val="Heading3"/>
@@ -7170,8 +7059,8 @@
         <w:t xml:space="preserve">see the full timeline before any work is submitted.</w:t>
       </w:r>
     </w:p>
-    <w:bookmarkEnd w:id="48"/>
-    <w:bookmarkStart w:id="50" w:name="planning-diagram"/>
+    <w:bookmarkEnd w:id="49"/>
+    <w:bookmarkStart w:id="51" w:name="planning-diagram"/>
     <w:p>
       <w:pPr>
         <w:pStyle w:val="Heading3"/>
@@ -7214,7 +7103,7 @@
                     </pic:cNvPicPr>
                   </pic:nvPicPr>
                   <pic:blipFill>
-                    <a:blip r:embed="rId49"/>
+                    <a:blip r:embed="rId50"/>
                     <a:stretch>
                       <a:fillRect/>
                     </a:stretch>
@@ -7494,8 +7383,8 @@
         <w:t xml:space="preserve">.</w:t>
       </w:r>
     </w:p>
-    <w:bookmarkEnd w:id="50"/>
-    <w:bookmarkStart w:id="51" w:name="live-quota-redistribution"/>
+    <w:bookmarkEnd w:id="51"/>
+    <w:bookmarkStart w:id="52" w:name="live-quota-redistribution"/>
     <w:p>
       <w:pPr>
         <w:pStyle w:val="Heading3"/>
@@ -8027,9 +7916,9 @@
         </w:pict>
       </w:r>
     </w:p>
-    <w:bookmarkEnd w:id="51"/>
     <w:bookmarkEnd w:id="52"/>
-    <w:bookmarkStart w:id="58" w:name="adobe-api-integration"/>
+    <w:bookmarkEnd w:id="53"/>
+    <w:bookmarkStart w:id="59" w:name="adobe-api-integration"/>
     <w:p>
       <w:pPr>
         <w:pStyle w:val="Heading2"/>
@@ -8038,7 +7927,7 @@
         <w:t xml:space="preserve">6. Adobe API Integration</w:t>
       </w:r>
     </w:p>
-    <w:bookmarkStart w:id="53" w:name="api-summary"/>
+    <w:bookmarkStart w:id="54" w:name="api-summary"/>
     <w:p>
       <w:pPr>
         <w:pStyle w:val="Heading3"/>
@@ -8498,8 +8387,8 @@
         </w:tc>
       </w:tr>
     </w:tbl>
-    <w:bookmarkEnd w:id="53"/>
-    <w:bookmarkStart w:id="55" w:name="region-architecture"/>
+    <w:bookmarkEnd w:id="54"/>
+    <w:bookmarkStart w:id="56" w:name="region-architecture"/>
     <w:p>
       <w:pPr>
         <w:pStyle w:val="Heading3"/>
@@ -8627,7 +8516,7 @@
                     </pic:cNvPicPr>
                   </pic:nvPicPr>
                   <pic:blipFill>
-                    <a:blip r:embed="rId54"/>
+                    <a:blip r:embed="rId55"/>
                     <a:stretch>
                       <a:fillRect/>
                     </a:stretch>
@@ -8912,8 +8801,8 @@
         <w:t xml:space="preserve">.</w:t>
       </w:r>
     </w:p>
-    <w:bookmarkEnd w:id="55"/>
-    <w:bookmarkStart w:id="56" w:name="work-order-payload"/>
+    <w:bookmarkEnd w:id="56"/>
+    <w:bookmarkStart w:id="57" w:name="work-order-payload"/>
     <w:p>
       <w:pPr>
         <w:pStyle w:val="Heading3"/>
@@ -9898,8 +9787,8 @@
         </w:tc>
       </w:tr>
     </w:tbl>
-    <w:bookmarkEnd w:id="56"/>
-    <w:bookmarkStart w:id="57" w:name="identity-quota"/>
+    <w:bookmarkEnd w:id="57"/>
+    <w:bookmarkStart w:id="58" w:name="identity-quota"/>
     <w:p>
       <w:pPr>
         <w:pStyle w:val="Heading3"/>
@@ -10112,9 +10001,9 @@
         </w:pict>
       </w:r>
     </w:p>
-    <w:bookmarkEnd w:id="57"/>
     <w:bookmarkEnd w:id="58"/>
-    <w:bookmarkStart w:id="62" w:name="security-architecture"/>
+    <w:bookmarkEnd w:id="59"/>
+    <w:bookmarkStart w:id="63" w:name="security-architecture"/>
     <w:p>
       <w:pPr>
         <w:pStyle w:val="Heading2"/>
@@ -10123,7 +10012,7 @@
         <w:t xml:space="preserve">7. Security Architecture</w:t>
       </w:r>
     </w:p>
-    <w:bookmarkStart w:id="60" w:name="defense-in-depth-model"/>
+    <w:bookmarkStart w:id="61" w:name="defense-in-depth-model"/>
     <w:p>
       <w:pPr>
         <w:pStyle w:val="Heading3"/>
@@ -10207,7 +10096,7 @@
                     </pic:cNvPicPr>
                   </pic:nvPicPr>
                   <pic:blipFill>
-                    <a:blip r:embed="rId59"/>
+                    <a:blip r:embed="rId60"/>
                     <a:stretch>
                       <a:fillRect/>
                     </a:stretch>
@@ -10933,8 +10822,8 @@
         <w:t xml:space="preserve">.</w:t>
       </w:r>
     </w:p>
-    <w:bookmarkEnd w:id="60"/>
-    <w:bookmarkStart w:id="61" w:name="submission-safety"/>
+    <w:bookmarkEnd w:id="61"/>
+    <w:bookmarkStart w:id="62" w:name="submission-safety"/>
     <w:p>
       <w:pPr>
         <w:pStyle w:val="Heading3"/>
@@ -11135,9 +11024,9 @@
         </w:pict>
       </w:r>
     </w:p>
-    <w:bookmarkEnd w:id="61"/>
     <w:bookmarkEnd w:id="62"/>
-    <w:bookmarkStart w:id="73" w:name="environment-configuration-reference"/>
+    <w:bookmarkEnd w:id="63"/>
+    <w:bookmarkStart w:id="74" w:name="environment-configuration-reference"/>
     <w:p>
       <w:pPr>
         <w:pStyle w:val="Heading2"/>
@@ -11146,7 +11035,7 @@
         <w:t xml:space="preserve">8. Environment Configuration Reference</w:t>
       </w:r>
     </w:p>
-    <w:bookmarkStart w:id="69" w:name="complete-environment-variable-reference"/>
+    <w:bookmarkStart w:id="70" w:name="complete-environment-variable-reference"/>
     <w:p>
       <w:pPr>
         <w:pStyle w:val="Heading3"/>
@@ -11184,7 +11073,7 @@
         <w:t xml:space="preserve">on first launch. Set these to tune behavior for your deployment.</w:t>
       </w:r>
     </w:p>
-    <w:bookmarkStart w:id="63" w:name="network-server"/>
+    <w:bookmarkStart w:id="64" w:name="network-server"/>
     <w:p>
       <w:pPr>
         <w:pStyle w:val="Heading4"/>
@@ -11405,8 +11294,8 @@
         </w:tc>
       </w:tr>
     </w:tbl>
-    <w:bookmarkEnd w:id="63"/>
-    <w:bookmarkStart w:id="64" w:name="storage-paths"/>
+    <w:bookmarkEnd w:id="64"/>
+    <w:bookmarkStart w:id="65" w:name="storage-paths"/>
     <w:p>
       <w:pPr>
         <w:pStyle w:val="Heading4"/>
@@ -11684,8 +11573,8 @@
         </w:tc>
       </w:tr>
     </w:tbl>
-    <w:bookmarkEnd w:id="64"/>
-    <w:bookmarkStart w:id="65" w:name="security"/>
+    <w:bookmarkEnd w:id="65"/>
+    <w:bookmarkStart w:id="66" w:name="security"/>
     <w:p>
       <w:pPr>
         <w:pStyle w:val="Heading4"/>
@@ -11823,8 +11712,8 @@
         </w:tc>
       </w:tr>
     </w:tbl>
-    <w:bookmarkEnd w:id="65"/>
-    <w:bookmarkStart w:id="66" w:name="performance-tuning-scalability-knobs"/>
+    <w:bookmarkEnd w:id="66"/>
+    <w:bookmarkStart w:id="67" w:name="performance-tuning-scalability-knobs"/>
     <w:p>
       <w:pPr>
         <w:pStyle w:val="Heading4"/>
@@ -12141,8 +12030,8 @@
         </w:tc>
       </w:tr>
     </w:tbl>
-    <w:bookmarkEnd w:id="66"/>
-    <w:bookmarkStart w:id="67" w:name="quota-fallbacks"/>
+    <w:bookmarkEnd w:id="67"/>
+    <w:bookmarkStart w:id="68" w:name="quota-fallbacks"/>
     <w:p>
       <w:pPr>
         <w:pStyle w:val="Heading4"/>
@@ -12361,8 +12250,8 @@
         </w:tc>
       </w:tr>
     </w:tbl>
-    <w:bookmarkEnd w:id="67"/>
-    <w:bookmarkStart w:id="68" w:name="adobe-endpoints-advanced"/>
+    <w:bookmarkEnd w:id="68"/>
+    <w:bookmarkStart w:id="69" w:name="adobe-endpoints-advanced"/>
     <w:p>
       <w:pPr>
         <w:pStyle w:val="Heading4"/>
@@ -12598,9 +12487,9 @@
         </w:tc>
       </w:tr>
     </w:tbl>
-    <w:bookmarkEnd w:id="68"/>
     <w:bookmarkEnd w:id="69"/>
-    <w:bookmarkStart w:id="70" w:name="per-machine-tuning-recommendations"/>
+    <w:bookmarkEnd w:id="70"/>
+    <w:bookmarkStart w:id="71" w:name="per-machine-tuning-recommendations"/>
     <w:p>
       <w:pPr>
         <w:pStyle w:val="Heading3"/>
@@ -13037,8 +12926,8 @@
         </w:tc>
       </w:tr>
     </w:tbl>
-    <w:bookmarkEnd w:id="70"/>
-    <w:bookmarkStart w:id="71" w:name="development-testing"/>
+    <w:bookmarkEnd w:id="71"/>
+    <w:bookmarkStart w:id="72" w:name="development-testing"/>
     <w:p>
       <w:pPr>
         <w:pStyle w:val="Heading3"/>
@@ -13176,8 +13065,8 @@
         </w:tc>
       </w:tr>
     </w:tbl>
-    <w:bookmarkEnd w:id="71"/>
-    <w:bookmarkStart w:id="72" w:name="sample-.env-files"/>
+    <w:bookmarkEnd w:id="72"/>
+    <w:bookmarkStart w:id="73" w:name="sample-.env-files"/>
     <w:p>
       <w:pPr>
         <w:pStyle w:val="Heading3"/>
@@ -13390,9 +13279,9 @@
         </w:pict>
       </w:r>
     </w:p>
-    <w:bookmarkEnd w:id="72"/>
     <w:bookmarkEnd w:id="73"/>
-    <w:bookmarkStart w:id="81" w:name="operational-procedures"/>
+    <w:bookmarkEnd w:id="74"/>
+    <w:bookmarkStart w:id="82" w:name="operational-procedures"/>
     <w:p>
       <w:pPr>
         <w:pStyle w:val="Heading2"/>
@@ -13401,7 +13290,7 @@
         <w:t xml:space="preserve">9. Operational Procedures</w:t>
       </w:r>
     </w:p>
-    <w:bookmarkStart w:id="74" w:name="prerequisites"/>
+    <w:bookmarkStart w:id="75" w:name="prerequisites"/>
     <w:p>
       <w:pPr>
         <w:pStyle w:val="Heading3"/>
@@ -13499,8 +13388,8 @@
         <w:t xml:space="preserve">    nvm use 20</w:t>
       </w:r>
     </w:p>
-    <w:bookmarkEnd w:id="74"/>
-    <w:bookmarkStart w:id="75" w:name="installation-first-run"/>
+    <w:bookmarkEnd w:id="75"/>
+    <w:bookmarkStart w:id="76" w:name="installation-first-run"/>
     <w:p>
       <w:pPr>
         <w:pStyle w:val="Heading3"/>
@@ -13808,8 +13697,8 @@
         <w:t xml:space="preserve">to track progress.</w:t>
       </w:r>
     </w:p>
-    <w:bookmarkEnd w:id="75"/>
-    <w:bookmarkStart w:id="76" w:name="running-tests"/>
+    <w:bookmarkEnd w:id="76"/>
+    <w:bookmarkStart w:id="77" w:name="running-tests"/>
     <w:p>
       <w:pPr>
         <w:pStyle w:val="Heading3"/>
@@ -14017,8 +13906,8 @@
         <w:t xml:space="preserve">- End-to-end integration with fully-mocked Adobe (3 tests)</w:t>
       </w:r>
     </w:p>
-    <w:bookmarkEnd w:id="76"/>
-    <w:bookmarkStart w:id="77" w:name="recovering-from-a-crash"/>
+    <w:bookmarkEnd w:id="77"/>
+    <w:bookmarkStart w:id="78" w:name="recovering-from-a-crash"/>
     <w:p>
       <w:pPr>
         <w:pStyle w:val="Heading3"/>
@@ -14270,8 +14159,8 @@
         <w:t xml:space="preserve">for the next startup to retry.</w:t>
       </w:r>
     </w:p>
-    <w:bookmarkEnd w:id="77"/>
-    <w:bookmarkStart w:id="78" w:name="rotating-credentials"/>
+    <w:bookmarkEnd w:id="78"/>
+    <w:bookmarkStart w:id="79" w:name="rotating-credentials"/>
     <w:p>
       <w:pPr>
         <w:pStyle w:val="Heading3"/>
@@ -14352,8 +14241,8 @@
         <w:t xml:space="preserve">is saved. The in-memory token cache auto-invalidates on the next 401.</w:t>
       </w:r>
     </w:p>
-    <w:bookmarkEnd w:id="78"/>
-    <w:bookmarkStart w:id="79" w:name="full-reset-wipe-all-state"/>
+    <w:bookmarkEnd w:id="79"/>
+    <w:bookmarkStart w:id="80" w:name="full-reset-wipe-all-state"/>
     <w:p>
       <w:pPr>
         <w:pStyle w:val="Heading3"/>
@@ -14429,8 +14318,8 @@
         <w:t xml:space="preserve">A fresh Config tab awaits on next start.</w:t>
       </w:r>
     </w:p>
-    <w:bookmarkEnd w:id="79"/>
-    <w:bookmarkStart w:id="80" w:name="auto-resume-scheduler"/>
+    <w:bookmarkEnd w:id="80"/>
+    <w:bookmarkStart w:id="81" w:name="auto-resume-scheduler"/>
     <w:p>
       <w:pPr>
         <w:pStyle w:val="Heading3"/>
@@ -14682,9 +14571,9 @@
         </w:pict>
       </w:r>
     </w:p>
-    <w:bookmarkEnd w:id="80"/>
     <w:bookmarkEnd w:id="81"/>
-    <w:bookmarkStart w:id="88" w:name="design-decisions"/>
+    <w:bookmarkEnd w:id="82"/>
+    <w:bookmarkStart w:id="89" w:name="design-decisions"/>
     <w:p>
       <w:pPr>
         <w:pStyle w:val="Heading2"/>
@@ -14693,7 +14582,7 @@
         <w:t xml:space="preserve">10. Design Decisions</w:t>
       </w:r>
     </w:p>
-    <w:bookmarkStart w:id="82" w:name="why-sqlite-not-postgres-or-redis"/>
+    <w:bookmarkStart w:id="83" w:name="why-sqlite-not-postgres-or-redis"/>
     <w:p>
       <w:pPr>
         <w:pStyle w:val="Heading3"/>
@@ -14754,8 +14643,8 @@
         <w:t xml:space="preserve">explicitly out of scope (see §11).</w:t>
       </w:r>
     </w:p>
-    <w:bookmarkEnd w:id="82"/>
-    <w:bookmarkStart w:id="83" w:name="why-validate-before-the-network"/>
+    <w:bookmarkEnd w:id="83"/>
+    <w:bookmarkStart w:id="84" w:name="why-validate-before-the-network"/>
     <w:p>
       <w:pPr>
         <w:pStyle w:val="Heading3"/>
@@ -14802,8 +14691,8 @@
         <w:t xml:space="preserve">- Round-trip latency for mistakes catchable in microseconds.</w:t>
       </w:r>
     </w:p>
-    <w:bookmarkEnd w:id="83"/>
-    <w:bookmarkStart w:id="84" w:name="why-in-memory-ims-tokens-not-persisted"/>
+    <w:bookmarkEnd w:id="84"/>
+    <w:bookmarkStart w:id="85" w:name="why-in-memory-ims-tokens-not-persisted"/>
     <w:p>
       <w:pPr>
         <w:pStyle w:val="Heading3"/>
@@ -14853,8 +14742,8 @@
         <w:t xml:space="preserve">the performance cost is negligible; the security benefit is material.</w:t>
       </w:r>
     </w:p>
-    <w:bookmarkEnd w:id="84"/>
-    <w:bookmarkStart w:id="85" w:name="Xa0ece07ec830f69ced4c88411541552e4a71969"/>
+    <w:bookmarkEnd w:id="85"/>
+    <w:bookmarkStart w:id="86" w:name="Xa0ece07ec830f69ced4c88411541552e4a71969"/>
     <w:p>
       <w:pPr>
         <w:pStyle w:val="Heading3"/>
@@ -14904,8 +14793,8 @@
         <w:t xml:space="preserve">lookup on next boot.</w:t>
       </w:r>
     </w:p>
-    <w:bookmarkEnd w:id="85"/>
-    <w:bookmarkStart w:id="86" w:name="X171820582e456ea4f68e680ae34cc1aed2d7c38"/>
+    <w:bookmarkEnd w:id="86"/>
+    <w:bookmarkStart w:id="87" w:name="X171820582e456ea4f68e680ae34cc1aed2d7c38"/>
     <w:p>
       <w:pPr>
         <w:pStyle w:val="Heading3"/>
@@ -15053,8 +14942,8 @@
         <w:t xml:space="preserve">at planning time — much faster overall.</w:t>
       </w:r>
     </w:p>
-    <w:bookmarkEnd w:id="86"/>
-    <w:bookmarkStart w:id="87" w:name="why-wave-based-expansion-scheduling"/>
+    <w:bookmarkEnd w:id="87"/>
+    <w:bookmarkStart w:id="88" w:name="why-wave-based-expansion-scheduling"/>
     <w:p>
       <w:pPr>
         <w:pStyle w:val="Heading3"/>
@@ -15117,9 +15006,9 @@
         </w:pict>
       </w:r>
     </w:p>
-    <w:bookmarkEnd w:id="87"/>
     <w:bookmarkEnd w:id="88"/>
-    <w:bookmarkStart w:id="92" w:name="known-limitations-extension-points"/>
+    <w:bookmarkEnd w:id="89"/>
+    <w:bookmarkStart w:id="93" w:name="known-limitations-extension-points"/>
     <w:p>
       <w:pPr>
         <w:pStyle w:val="Heading2"/>
@@ -15128,7 +15017,7 @@
         <w:t xml:space="preserve">11. Known Limitations &amp; Extension Points</w:t>
       </w:r>
     </w:p>
-    <w:bookmarkStart w:id="89" w:name="current-limitations"/>
+    <w:bookmarkStart w:id="90" w:name="current-limitations"/>
     <w:p>
       <w:pPr>
         <w:pStyle w:val="Heading3"/>
@@ -15490,8 +15379,8 @@
         </w:tc>
       </w:tr>
     </w:tbl>
-    <w:bookmarkEnd w:id="89"/>
-    <w:bookmarkStart w:id="90" w:name="X453b045b2e7a31e94cbb13426a9dc6edda13b3a"/>
+    <w:bookmarkEnd w:id="90"/>
+    <w:bookmarkStart w:id="91" w:name="X453b045b2e7a31e94cbb13426a9dc6edda13b3a"/>
     <w:p>
       <w:pPr>
         <w:pStyle w:val="Heading3"/>
@@ -15984,8 +15873,8 @@
         </w:tc>
       </w:tr>
     </w:tbl>
-    <w:bookmarkEnd w:id="90"/>
-    <w:bookmarkStart w:id="91" w:name="extension-points"/>
+    <w:bookmarkEnd w:id="91"/>
+    <w:bookmarkStart w:id="92" w:name="extension-points"/>
     <w:p>
       <w:pPr>
         <w:pStyle w:val="Heading3"/>
@@ -16254,9 +16143,9 @@
         </w:pict>
       </w:r>
     </w:p>
-    <w:bookmarkEnd w:id="91"/>
     <w:bookmarkEnd w:id="92"/>
-    <w:bookmarkStart w:id="93" w:name="appendix-file-map"/>
+    <w:bookmarkEnd w:id="93"/>
+    <w:bookmarkStart w:id="94" w:name="appendix-file-map"/>
     <w:p>
       <w:pPr>
         <w:pStyle w:val="Heading2"/>
@@ -17075,8 +16964,8 @@
         </w:pict>
       </w:r>
     </w:p>
-    <w:bookmarkEnd w:id="93"/>
-    <w:bookmarkStart w:id="106" w:name="ui-screen-walkthrough"/>
+    <w:bookmarkEnd w:id="94"/>
+    <w:bookmarkStart w:id="107" w:name="ui-screen-walkthrough"/>
     <w:p>
       <w:pPr>
         <w:pStyle w:val="Heading2"/>
@@ -17150,7 +17039,7 @@
       <w:r>
         <w:t xml:space="preserve"> </w:t>
       </w:r>
-      <w:hyperlink r:id="rId23">
+      <w:hyperlink r:id="rId24">
         <w:r>
           <w:rPr>
             <w:rStyle w:val="VerbatimChar"/>
@@ -17162,7 +17051,7 @@
         <w:t xml:space="preserve">.</w:t>
       </w:r>
     </w:p>
-    <w:bookmarkStart w:id="95" w:name="environment-credentials-sandbox"/>
+    <w:bookmarkStart w:id="96" w:name="environment-credentials-sandbox"/>
     <w:p>
       <w:pPr>
         <w:pStyle w:val="Heading3"/>
@@ -17221,7 +17110,7 @@
                     </pic:cNvPicPr>
                   </pic:nvPicPr>
                   <pic:blipFill>
-                    <a:blip r:embed="rId94"/>
+                    <a:blip r:embed="rId95"/>
                     <a:stretch>
                       <a:fillRect/>
                     </a:stretch>
@@ -17256,8 +17145,8 @@
         <w:t xml:space="preserve">Environment configuration</w:t>
       </w:r>
     </w:p>
-    <w:bookmarkEnd w:id="95"/>
-    <w:bookmarkStart w:id="97" w:name="source-csv-upload-identifiers"/>
+    <w:bookmarkEnd w:id="96"/>
+    <w:bookmarkStart w:id="98" w:name="source-csv-upload-identifiers"/>
     <w:p>
       <w:pPr>
         <w:pStyle w:val="Heading3"/>
@@ -17300,7 +17189,7 @@
                     </pic:cNvPicPr>
                   </pic:nvPicPr>
                   <pic:blipFill>
-                    <a:blip r:embed="rId96"/>
+                    <a:blip r:embed="rId97"/>
                     <a:stretch>
                       <a:fillRect/>
                     </a:stretch>
@@ -17335,8 +17224,8 @@
         <w:t xml:space="preserve">Upload source identities</w:t>
       </w:r>
     </w:p>
-    <w:bookmarkEnd w:id="97"/>
-    <w:bookmarkStart w:id="99" w:name="expansion-resolve-the-identity-graph"/>
+    <w:bookmarkEnd w:id="98"/>
+    <w:bookmarkStart w:id="100" w:name="expansion-resolve-the-identity-graph"/>
     <w:p>
       <w:pPr>
         <w:pStyle w:val="Heading3"/>
@@ -17400,7 +17289,7 @@
                     </pic:cNvPicPr>
                   </pic:nvPicPr>
                   <pic:blipFill>
-                    <a:blip r:embed="rId98"/>
+                    <a:blip r:embed="rId99"/>
                     <a:stretch>
                       <a:fillRect/>
                     </a:stretch>
@@ -17435,8 +17324,8 @@
         <w:t xml:space="preserve">Identity graph expansion</w:t>
       </w:r>
     </w:p>
-    <w:bookmarkEnd w:id="99"/>
-    <w:bookmarkStart w:id="101" w:name="batch-planning-group-into-work-orders"/>
+    <w:bookmarkEnd w:id="100"/>
+    <w:bookmarkStart w:id="102" w:name="batch-planning-group-into-work-orders"/>
     <w:p>
       <w:pPr>
         <w:pStyle w:val="Heading3"/>
@@ -17479,7 +17368,7 @@
                     </pic:cNvPicPr>
                   </pic:nvPicPr>
                   <pic:blipFill>
-                    <a:blip r:embed="rId100"/>
+                    <a:blip r:embed="rId101"/>
                     <a:stretch>
                       <a:fillRect/>
                     </a:stretch>
@@ -17514,8 +17403,8 @@
         <w:t xml:space="preserve">Work order batch planning</w:t>
       </w:r>
     </w:p>
-    <w:bookmarkEnd w:id="101"/>
-    <w:bookmarkStart w:id="103" w:name="submit-ship-work-orders-to-adobe"/>
+    <w:bookmarkEnd w:id="102"/>
+    <w:bookmarkStart w:id="104" w:name="submit-ship-work-orders-to-adobe"/>
     <w:p>
       <w:pPr>
         <w:pStyle w:val="Heading3"/>
@@ -17586,7 +17475,7 @@
                     </pic:cNvPicPr>
                   </pic:nvPicPr>
                   <pic:blipFill>
-                    <a:blip r:embed="rId102"/>
+                    <a:blip r:embed="rId103"/>
                     <a:stretch>
                       <a:fillRect/>
                     </a:stretch>
@@ -17621,8 +17510,8 @@
         <w:t xml:space="preserve">Submit work orders</w:t>
       </w:r>
     </w:p>
-    <w:bookmarkEnd w:id="103"/>
-    <w:bookmarkStart w:id="105" w:name="monitor-track-adobe-side-progress"/>
+    <w:bookmarkEnd w:id="104"/>
+    <w:bookmarkStart w:id="106" w:name="monitor-track-adobe-side-progress"/>
     <w:p>
       <w:pPr>
         <w:pStyle w:val="Heading3"/>
@@ -17665,7 +17554,7 @@
                     </pic:cNvPicPr>
                   </pic:nvPicPr>
                   <pic:blipFill>
-                    <a:blip r:embed="rId104"/>
+                    <a:blip r:embed="rId105"/>
                     <a:stretch>
                       <a:fillRect/>
                     </a:stretch>
@@ -17719,9 +17608,9 @@
         <w:t xml:space="preserve">Document end — AEP Data Lifecycle Helper Design Document v3.1.0</w:t>
       </w:r>
     </w:p>
-    <w:bookmarkEnd w:id="105"/>
     <w:bookmarkEnd w:id="106"/>
     <w:bookmarkEnd w:id="107"/>
+    <w:bookmarkEnd w:id="108"/>
     <w:sectPr/>
   </w:body>
 </w:document>

</xml_diff>

<commit_message>
docs: re-export all 8 architecture diagrams at 3x (print-quality)
Closes the reviewer's diagram-resolution caveat (500-820px was soft for print).
All 8 Figma diagrams re-exported at 3x (now 1500-2460px wide, ~256-384KB each);
display size in the doc is unchanged (width caps preserved), just ~3x crisper.

Figma get_screenshot only renders at native size, so each frame was cloned,
rescale(3)'d (scales fonts proportionally), captured at full resolution, and the
clones deleted — source frames untouched, Inter fonts perfect. DESIGN_DOC.docx
regenerated (2.97 -> 4.35MB); still 0 oversized images, all XML well-formed.
</commit_message>
<xml_diff>
--- a/docs/DESIGN_DOC.docx
+++ b/docs/DESIGN_DOC.docx
@@ -1908,7 +1908,7 @@
       <w:r>
         <w:drawing>
           <wp:inline>
-            <wp:extent cx="5334000" cy="4644482"/>
+            <wp:extent cx="5334000" cy="4570760"/>
             <wp:effectExtent b="0" l="0" r="0" t="0"/>
             <wp:docPr descr="System Architecture" title="" id="1" name="Picture"/>
             <a:graphic>
@@ -1929,7 +1929,7 @@
                   <pic:spPr bwMode="auto">
                     <a:xfrm>
                       <a:off x="0" y="0"/>
-                      <a:ext cx="5334000" cy="4644482"/>
+                      <a:ext cx="5334000" cy="4570760"/>
                     </a:xfrm>
                     <a:prstGeom prst="rect">
                       <a:avLst/>
@@ -3502,7 +3502,7 @@
       <w:r>
         <w:drawing>
           <wp:inline>
-            <wp:extent cx="3749040" cy="6085941"/>
+            <wp:extent cx="3749040" cy="6106769"/>
             <wp:effectExtent b="0" l="0" r="0" t="0"/>
             <wp:docPr descr="Expansion data flow" title="" id="1" name="Picture"/>
             <a:graphic>
@@ -3523,7 +3523,7 @@
                   <pic:spPr bwMode="auto">
                     <a:xfrm>
                       <a:off x="0" y="0"/>
-                      <a:ext cx="3749040" cy="6085941"/>
+                      <a:ext cx="3749040" cy="6106769"/>
                     </a:xfrm>
                     <a:prstGeom prst="rect">
                       <a:avLst/>
@@ -5554,7 +5554,7 @@
       <w:r>
         <w:drawing>
           <wp:inline>
-            <wp:extent cx="4572000" cy="6155871"/>
+            <wp:extent cx="4572000" cy="6166757"/>
             <wp:effectExtent b="0" l="0" r="0" t="0"/>
             <wp:docPr descr="Work-order state machine" title="" id="1" name="Picture"/>
             <a:graphic>
@@ -5575,7 +5575,7 @@
                   <pic:spPr bwMode="auto">
                     <a:xfrm>
                       <a:off x="0" y="0"/>
-                      <a:ext cx="4572000" cy="6155871"/>
+                      <a:ext cx="4572000" cy="6166757"/>
                     </a:xfrm>
                     <a:prstGeom prst="rect">
                       <a:avLst/>
@@ -7098,7 +7098,7 @@
       <w:r>
         <w:drawing>
           <wp:inline>
-            <wp:extent cx="3794760" cy="6158353"/>
+            <wp:extent cx="3794760" cy="6169195"/>
             <wp:effectExtent b="0" l="0" r="0" t="0"/>
             <wp:docPr descr="Submit and reconcile flow" title="" id="1" name="Picture"/>
             <a:graphic>
@@ -7119,7 +7119,7 @@
                   <pic:spPr bwMode="auto">
                     <a:xfrm>
                       <a:off x="0" y="0"/>
-                      <a:ext cx="3794760" cy="6158353"/>
+                      <a:ext cx="3794760" cy="6169195"/>
                     </a:xfrm>
                     <a:prstGeom prst="rect">
                       <a:avLst/>
@@ -7501,7 +7501,7 @@
       <w:r>
         <w:drawing>
           <wp:inline>
-            <wp:extent cx="3977640" cy="6172708"/>
+            <wp:extent cx="3977640" cy="6167797"/>
             <wp:effectExtent b="0" l="0" r="0" t="0"/>
             <wp:docPr descr="Multi-month planning" title="" id="1" name="Picture"/>
             <a:graphic>
@@ -7522,7 +7522,7 @@
                   <pic:spPr bwMode="auto">
                     <a:xfrm>
                       <a:off x="0" y="0"/>
-                      <a:ext cx="3977640" cy="6172708"/>
+                      <a:ext cx="3977640" cy="6167797"/>
                     </a:xfrm>
                     <a:prstGeom prst="rect">
                       <a:avLst/>
@@ -8764,7 +8764,7 @@
       <w:r>
         <w:drawing>
           <wp:inline>
-            <wp:extent cx="5334000" cy="5317331"/>
+            <wp:extent cx="5334000" cy="5314553"/>
             <wp:effectExtent b="0" l="0" r="0" t="0"/>
             <wp:docPr descr="Region architecture" title="" id="1" name="Picture"/>
             <a:graphic>
@@ -8785,7 +8785,7 @@
                   <pic:spPr bwMode="auto">
                     <a:xfrm>
                       <a:off x="0" y="0"/>
-                      <a:ext cx="5334000" cy="5317331"/>
+                      <a:ext cx="5334000" cy="5314553"/>
                     </a:xfrm>
                     <a:prstGeom prst="rect">
                       <a:avLst/>
@@ -10344,7 +10344,7 @@
       <w:r>
         <w:drawing>
           <wp:inline>
-            <wp:extent cx="5334000" cy="6260041"/>
+            <wp:extent cx="5334000" cy="6331655"/>
             <wp:effectExtent b="0" l="0" r="0" t="0"/>
             <wp:docPr descr="Defense-in-depth" title="" id="1" name="Picture"/>
             <a:graphic>
@@ -10365,7 +10365,7 @@
                   <pic:spPr bwMode="auto">
                     <a:xfrm>
                       <a:off x="0" y="0"/>
-                      <a:ext cx="5334000" cy="6260041"/>
+                      <a:ext cx="5334000" cy="6331655"/>
                     </a:xfrm>
                     <a:prstGeom prst="rect">
                       <a:avLst/>

</xml_diff>